<commit_message>
Roteiro Rick: ajustes finos na parte 2
Co-Authored-By: Claude Opus 5.5 <noreply@anthropic.com>
Claude-Session: https://claude.ai/code/session_01MJjUEEZrxQDEUifKK2vj9g
</commit_message>
<xml_diff>
--- a/roteiros/rick/Rick_Parte2.docx
+++ b/roteiros/rick/Rick_Parte2.docx
@@ -303,7 +303,7 @@
         <w:rPr>
           <w:color w:val="C00000"/>
         </w:rPr>
-        <w:t>E foi aí que Santa Catarina entrou nessa história de um jeito que ninguém esqueceria. Muito antes do helicóptero. Muito antes da serra. Num palco, no primeiro dia do ano, diante de milhares de pessoas que não faziam ideia do que estavam prestes a ouvir.</w:t>
+        <w:t>E foi aí que Santa Catarina entrou nessa história de um jeito que ninguém esqueceria. Quinze anos antes do helicóptero, num palco, no primeiro dia do ano, diante de milhares de pessoas que não faziam ideia do que estavam prestes a ouvir.</w:t>
       </w:r>
     </w:p>
     <w:p>
@@ -568,6 +568,14 @@
           <w:color w:val="000000"/>
         </w:rPr>
         <w:t>Segunda-feira, vinte e um de setembro de dois mil e vinte e seis.</w:t>
+      </w:r>
+    </w:p>
+    <w:p>
+      <w:r>
+        <w:rPr>
+          <w:color w:val="C00000"/>
+        </w:rPr>
+        <w:t>Segunda-feira. O mesmo dia da semana em que, vinte e cinco anos antes, uma BMW atravessou o canteiro da Rodovia Luiz de Queiroz. Guarde isso também.</w:t>
       </w:r>
     </w:p>
     <w:p>

</xml_diff>